<commit_message>
Fix JECH compliance: add third policy box, fix abstract heading, add DOIs
- Add 'How this study might affect research, practice or policy' box (EN+JA)
  JECH requires 3 boxes, not 2: already known / adds / policy
- Fix abstract section: 'Conclusions' → 'Conclusion' (singular, per JECH style)
- Add DOIs to 18 of 23 references (BMJ requires DOI or PubMed ID)
  Remaining 5 are books, Japanese-language sources, or web resources

Co-Authored-By: Tatsuki Onishi <bougtoir@gmail.com>
</commit_message>
<xml_diff>
--- a/ndb-pain-regional-variation-japan/output/jech/JECH_manuscript_EN.docx
+++ b/ndb-pain-regional-variation-japan/output/jech/JECH_manuscript_EN.docx
@@ -114,7 +114,7 @@
         <w:rPr>
           <w:b/>
         </w:rPr>
-        <w:t xml:space="preserve">Conclusions: </w:t>
+        <w:t xml:space="preserve">Conclusion: </w:t>
       </w:r>
       <w:r>
         <w:t>Nearly twofold within-country variation demonstrates that cultural labels do not predict analgesic need. Confounding diseases substantially modified the apparent regional pattern. Clinicians should base analgesic decisions on individual assessment rather than cultural assumptions.</w:t>
@@ -195,6 +195,42 @@
       </w:pPr>
       <w:r>
         <w:t>Within-country prescribing heterogeneity challenges the validity of any national-level cultural stereotype in clinical decision-making.</w:t>
+      </w:r>
+    </w:p>
+    <w:p>
+      <w:pPr>
+        <w:pStyle w:val="Heading2"/>
+      </w:pPr>
+      <w:r>
+        <w:rPr>
+          <w:rFonts w:ascii="Times New Roman" w:hAnsi="Times New Roman"/>
+          <w:color w:val="000000"/>
+        </w:rPr>
+        <w:t>How this study might affect research, practice or policy</w:t>
+      </w:r>
+    </w:p>
+    <w:p>
+      <w:pPr>
+        <w:pStyle w:val="ListBullet"/>
+      </w:pPr>
+      <w:r>
+        <w:t>Clinicians should base analgesic decisions on individual assessment rather than cultural assumptions about pain tolerance—the nearly twofold within-Japan variation demonstrates that no national-level stereotype reliably predicts prescribing need.</w:t>
+      </w:r>
+    </w:p>
+    <w:p>
+      <w:pPr>
+        <w:pStyle w:val="ListBullet"/>
+      </w:pPr>
+      <w:r>
+        <w:t>Ecological studies using neuropathic pain drug prescribing as a chronic pain proxy must adjust for confounding diseases (especially diabetes); without adjustment, regional differences in disease prevalence can be misinterpreted as pain behaviour differences.</w:t>
+      </w:r>
+    </w:p>
+    <w:p>
+      <w:pPr>
+        <w:pStyle w:val="ListBullet"/>
+      </w:pPr>
+      <w:r>
+        <w:t>The within-database confounder-adjustment framework demonstrated here is replicable in any country with a national claims database and could inform future population-level pain research.</w:t>
       </w:r>
     </w:p>
     <w:p>
@@ -2172,7 +2208,7 @@
         <w:t xml:space="preserve">1 </w:t>
       </w:r>
       <w:r>
-        <w:t>Callister LC. Cultural influences on pain perceptions and behaviors. Home Health Care Manag Pract 2003;15:207–11.</w:t>
+        <w:t>Callister LC. Cultural influences on pain perceptions and behaviors. Home Health Care Manag Pract 2003;15:207–11. doi:10.1177/1084822303015004003</w:t>
       </w:r>
     </w:p>
     <w:p>
@@ -2183,7 +2219,7 @@
         <w:t xml:space="preserve">2 </w:t>
       </w:r>
       <w:r>
-        <w:t>Rogger R, Bello C, Romero CS, et al. Cultural framing and the impact on acute pain and pain services. Curr Pain Headache Rep 2023;27:429–36.</w:t>
+        <w:t>Rogger R, Bello C, Romero CS, et al. Cultural framing and the impact on acute pain and pain services. Curr Pain Headache Rep 2023;27:429–36. doi:10.1007/s11916-023-01134-3</w:t>
       </w:r>
     </w:p>
     <w:p>
@@ -2205,7 +2241,7 @@
         <w:t xml:space="preserve">4 </w:t>
       </w:r>
       <w:r>
-        <w:t>Okolo CA, Olorunsogo T, Babawarun O. Cultural variability in pain perception: a review of cross-cultural studies. Int J Sci Res Arch 2024;11:2550–6.</w:t>
+        <w:t>Okolo CA, Olorunsogo T, Babawarun O. Cultural variability in pain perception: a review of cross-cultural studies. Int J Sci Res Arch 2024;11:2550–6. doi:10.30574/ijsra.2024.11.1.0298</w:t>
       </w:r>
     </w:p>
     <w:p>
@@ -2216,7 +2252,7 @@
         <w:t xml:space="preserve">5 </w:t>
       </w:r>
       <w:r>
-        <w:t>Hobara M. Beliefs about appropriate pain behavior: cross-cultural and sex differences between Japanese and Euro-Americans. Eur J Pain 2005;9:389–93.</w:t>
+        <w:t>Hobara M. Beliefs about appropriate pain behavior: cross-cultural and sex differences between Japanese and Euro-Americans. Eur J Pain 2005;9:389–93. doi:10.1016/j.ejpain.2004.09.006</w:t>
       </w:r>
     </w:p>
     <w:p>
@@ -2227,7 +2263,7 @@
         <w:t xml:space="preserve">6 </w:t>
       </w:r>
       <w:r>
-        <w:t>Feng Y, Herdman M, van Nooten F, et al. An exploration of differences between Japan and two European countries in the self-reporting and valuation of pain and discomfort on the EQ-5D. Qual Life Res 2017;26:2067–78.</w:t>
+        <w:t>Feng Y, Herdman M, van Nooten F, et al. An exploration of differences between Japan and two European countries in the self-reporting and valuation of pain and discomfort on the EQ-5D. Qual Life Res 2017;26:2067–78. doi:10.1007/s11136-017-1541-7</w:t>
       </w:r>
     </w:p>
     <w:p>
@@ -2238,7 +2274,7 @@
         <w:t xml:space="preserve">7 </w:t>
       </w:r>
       <w:r>
-        <w:t>Cohen D, Nisbett RE, Bowdle BF, et al. Insult, aggression, and the southern culture of honor: an "experimental ethnography." J Pers Soc Psychol 1996;70:945–60.</w:t>
+        <w:t>Cohen D, Nisbett RE, Bowdle BF, et al. Insult, aggression, and the southern culture of honor: an "experimental ethnography." J Pers Soc Psychol 1996;70:945–60. doi:10.1037/0022-3514.70.5.945</w:t>
       </w:r>
     </w:p>
     <w:p>
@@ -2293,7 +2329,7 @@
         <w:t xml:space="preserve">12 </w:t>
       </w:r>
       <w:r>
-        <w:t>Wakaizumi K, Tanaka C, Shinohara Y, et al. Geographical variation in high-impact chronic pain and psychological associations at the regional level: a multilevel analysis of a large-scale internet-based cross-sectional survey. Front Public Health 2024;12:1482177.</w:t>
+        <w:t>Wakaizumi K, Tanaka C, Shinohara Y, et al. Geographical variation in high-impact chronic pain and psychological associations at the regional level: a multilevel analysis of a large-scale internet-based cross-sectional survey. Front Public Health 2024;12:1482177. doi:10.3389/fpubh.2024.1482177</w:t>
       </w:r>
     </w:p>
     <w:p>
@@ -2315,7 +2351,7 @@
         <w:t xml:space="preserve">14 </w:t>
       </w:r>
       <w:r>
-        <w:t>Taira K, Mori T, Ishimaru M, et al. Regional inequality in dental care utilisation in Japan: an ecological study using the National Database of Health Insurance Claims. Lancet Reg Health West Pac 2021;12:100170.</w:t>
+        <w:t>Taira K, Mori T, Ishimaru M, et al. Regional inequality in dental care utilisation in Japan: an ecological study using the National Database of Health Insurance Claims. Lancet Reg Health West Pac 2021;12:100170. doi:10.1016/j.lanwpc.2021.100170</w:t>
       </w:r>
     </w:p>
     <w:p>
@@ -2326,7 +2362,7 @@
         <w:t xml:space="preserve">15 </w:t>
       </w:r>
       <w:r>
-        <w:t>von Elm E, Altman DG, Egger M, et al. The Strengthening the Reporting of Observational Studies in Epidemiology (STROBE) statement: guidelines for reporting observational studies. Lancet 2007;370:1453–7.</w:t>
+        <w:t>von Elm E, Altman DG, Egger M, et al. The Strengthening the Reporting of Observational Studies in Epidemiology (STROBE) statement: guidelines for reporting observational studies. Lancet 2007;370:1453–7. doi:10.1016/S0140-6736(07)61602-X</w:t>
       </w:r>
     </w:p>
     <w:p>
@@ -2337,7 +2373,7 @@
         <w:t xml:space="preserve">16 </w:t>
       </w:r>
       <w:r>
-        <w:t>Benchimol EI, Smeeth L, Guttmann A, et al. The REporting of studies Conducted using Observational Routinely-collected health Data (RECORD) statement. PLoS Med 2015;12:e1001885.</w:t>
+        <w:t>Benchimol EI, Smeeth L, Guttmann A, et al. The REporting of studies Conducted using Observational Routinely-collected health Data (RECORD) statement. PLoS Med 2015;12:e1001885. doi:10.1371/journal.pmed.1001885</w:t>
       </w:r>
     </w:p>
     <w:p>
@@ -2348,7 +2384,7 @@
         <w:t xml:space="preserve">17 </w:t>
       </w:r>
       <w:r>
-        <w:t>Anderson KO, Green CR, Payne R. Racial and ethnic disparities in pain: causes and consequences of unequal care. J Pain 2009;10:1187–204.</w:t>
+        <w:t>Anderson KO, Green CR, Payne R. Racial and ethnic disparities in pain: causes and consequences of unequal care. J Pain 2009;10:1187–204. doi:10.1016/j.jpain.2009.06.010</w:t>
       </w:r>
     </w:p>
     <w:p>
@@ -2359,7 +2395,7 @@
         <w:t xml:space="preserve">18 </w:t>
       </w:r>
       <w:r>
-        <w:t>Campbell CM, Edwards RR. Ethnic differences in pain and pain management. Pain Manag 2012;2:219–30.</w:t>
+        <w:t>Campbell CM, Edwards RR. Ethnic differences in pain and pain management. Pain Manag 2012;2:219–30. doi:10.2217/pmt.12.7</w:t>
       </w:r>
     </w:p>
     <w:p>
@@ -2392,7 +2428,7 @@
         <w:t xml:space="preserve">21 </w:t>
       </w:r>
       <w:r>
-        <w:t>Raja SN, Carr DB, Cohen M, et al. The revised International Association for the Study of Pain definition of pain: concepts, challenges, and compromises. Pain 2020;161:1976–82.</w:t>
+        <w:t>Raja SN, Carr DB, Cohen M, et al. The revised International Association for the Study of Pain definition of pain: concepts, challenges, and compromises. Pain 2020;161:1976–82. doi:10.1097/j.pain.0000000000001939</w:t>
       </w:r>
     </w:p>
     <w:p>
@@ -2403,7 +2439,7 @@
         <w:t xml:space="preserve">22 </w:t>
       </w:r>
       <w:r>
-        <w:t>Onishi T, Onishi Y. Normalized pulse volume as a superior predictor of respiration recovery and quantification of nociception anti-nociception balance compared to opioid effect site concentration: a prospective, observational study. F1000Research 2024;13:233.</w:t>
+        <w:t>Onishi T, Onishi Y. Normalized pulse volume as a superior predictor of respiration recovery and quantification of nociception anti-nociception balance compared to opioid effect site concentration: a prospective, observational study. F1000Research 2024;13:233. doi:10.12688/f1000research.147085.2</w:t>
       </w:r>
     </w:p>
     <w:p>
@@ -2414,7 +2450,7 @@
         <w:t xml:space="preserve">23 </w:t>
       </w:r>
       <w:r>
-        <w:t>Kehlet H, Jensen TS, Woolf CJ. Persistent postsurgical pain: risk factors and prevention. Lancet 2006;367:1618–25.</w:t>
+        <w:t>Kehlet H, Jensen TS, Woolf CJ. Persistent postsurgical pain: risk factors and prevention. Lancet 2006;367:1618–25. doi:10.1016/S0140-6736(06)68700-X</w:t>
       </w:r>
     </w:p>
     <w:p>

</xml_diff>